<commit_message>
contratos-clientes: comando, agente, skills e ajustes de escopo
- Testemunha da SCIENT fixa no template (Matheus Abraão Pinheiro Ferreira)
- Comando /gerar-contrato-cliente e agente redator-contrato-cliente
- Skill homologacao (informativa: dados + docs + aviso do CRF; sem PDF/upload)
- Skill contratos-clientes (convenções: código, produto, título, CNPJ, campos)
- Script cnpj_lookup.py (consulta CNPJ; fallback se rede bloquear)
- Intake pede financeiro do cliente (nome/e-mail/telefone p/ NF e boletos)
- Escopo: por ora só gera .docx para download (sem upload/PDF em pasta)

Co-Authored-By: Claude Opus 4.8 <noreply@anthropic.com>
Claude-Session: https://claude.ai/code/session_01HrnpzzFeHRtBe1dRWCL3oW
</commit_message>
<xml_diff>
--- a/contratos-clientes/templates/cliente.docx
+++ b/contratos-clientes/templates/cliente.docx
@@ -7661,7 +7661,7 @@
           <w:sz w:val="21"/>
           <w:szCs w:val="21"/>
         </w:rPr>
-        <w:t>Nome: Giovanni Barbosa Salvador</w:t>
+        <w:t>Nome: Matheus Abraão Pinheiro Ferreira</w:t>
       </w:r>
       <w:r>
         <w:rPr>
@@ -7708,7 +7708,7 @@
           <w:sz w:val="21"/>
           <w:szCs w:val="21"/>
         </w:rPr>
-        <w:t>CPF: 366.599.668-62</w:t>
+        <w:t>CPF: 125.217.057-21CPF:</w:t>
       </w:r>
       <w:r>
         <w:rPr>
@@ -7725,7 +7725,7 @@
           <w:szCs w:val="21"/>
         </w:rPr>
         <w:tab/>
-        <w:t>CPF:</w:t>
+        <w:t/>
       </w:r>
     </w:p>
     <w:p>
@@ -7747,7 +7747,7 @@
           <w:sz w:val="21"/>
           <w:szCs w:val="21"/>
         </w:rPr>
-        <w:t>CNH: 05838128488</w:t>
+        <w:t>RG:RG:</w:t>
       </w:r>
       <w:r>
         <w:rPr>
@@ -7764,7 +7764,7 @@
           <w:szCs w:val="21"/>
         </w:rPr>
         <w:tab/>
-        <w:t>RG:</w:t>
+        <w:t/>
       </w:r>
     </w:p>
     <w:p>

</xml_diff>